<commit_message>
feat: enhance lead and workflow management with new assignment and notification features
</commit_message>
<xml_diff>
--- a/docs/internal-test/装修服务内测-角色-测量员.docx
+++ b/docs/internal-test/装修服务内测-角色-测量员.docx
@@ -234,7 +234,7 @@
           <w:color w:val="1F2A26"/>
           <w:sz w:val="22"/>
         </w:rPr>
-        <w:t>「设计」发布入口；不能看介绍人收益规则配置</w:t>
+        <w:t>「设计」发布入口；不能看推广人收益规则配置</w:t>
       </w:r>
     </w:p>
     <w:p>
@@ -527,6 +527,20 @@
     </w:p>
     <w:p>
       <w:pPr>
+        <w:spacing w:before="0" w:after="160" w:line="298" w:lineRule="auto"/>
+      </w:pPr>
+      <w:r>
+        <w:rPr>
+          <w:rFonts w:ascii="Calibri" w:hAnsi="Calibri" w:eastAsia="Microsoft YaHei"/>
+          <w:b w:val="0"/>
+          <w:color w:val="1F2A26"/>
+          <w:sz w:val="22"/>
+        </w:rPr>
+        <w:t>连测距仪、进编辑器怎么画墙、闭合与提交，逐步操作见单独手册：`操作-测距仪与量房.md`（Word：`装修服务内测-操作-测距仪与量房.docx`）。本说明书只留验收勾选。</w:t>
+      </w:r>
+    </w:p>
+    <w:p>
+      <w:pPr>
         <w:spacing w:before="20" w:after="80" w:line="288" w:lineRule="auto"/>
         <w:ind w:left="312"/>
       </w:pPr>
@@ -611,7 +625,7 @@
           <w:color w:val="1F2A26"/>
           <w:sz w:val="22"/>
         </w:rPr>
-        <w:t>，不要在别的菜单找</w:t>
+        <w:t>（立即量房 / 继续量房 / 新增量房）；「链接测距仪」只连设备，不进编辑器</w:t>
       </w:r>
     </w:p>
     <w:p>
@@ -635,7 +649,7 @@
           <w:color w:val="1F2A26"/>
           <w:sz w:val="22"/>
         </w:rPr>
-        <w:t>没提交合格户型时，点「确认完成量房」应失败</w:t>
+        <w:t>按《操作-测距仪与量房》画完并「完成」至少一个闭合空间</w:t>
       </w:r>
     </w:p>
     <w:p>
@@ -659,7 +673,31 @@
           <w:color w:val="1F2A26"/>
           <w:sz w:val="22"/>
         </w:rPr>
-        <w:t>提交后进度「量房完成」；客户只能看摘要，不能自己改图</w:t>
+        <w:t>没提交合格户型时，「确认完成量房」不可用或应失败</w:t>
+      </w:r>
+    </w:p>
+    <w:p>
+      <w:pPr>
+        <w:spacing w:before="20" w:after="80" w:line="288" w:lineRule="auto"/>
+        <w:ind w:left="312"/>
+      </w:pPr>
+      <w:r>
+        <w:rPr>
+          <w:rFonts w:ascii="Calibri" w:hAnsi="Calibri" w:eastAsia="Microsoft YaHei"/>
+          <w:b/>
+          <w:color w:val="1F8A5B"/>
+          <w:sz w:val="22"/>
+        </w:rPr>
+        <w:t xml:space="preserve">☐  </w:t>
+      </w:r>
+      <w:r>
+        <w:rPr>
+          <w:rFonts w:ascii="Calibri" w:hAnsi="Calibri" w:eastAsia="Microsoft YaHei"/>
+          <w:b w:val="0"/>
+          <w:color w:val="1F2A26"/>
+          <w:sz w:val="22"/>
+        </w:rPr>
+        <w:t>预约确认完成后，客户只能看摘要，不能自己改图</w:t>
       </w:r>
     </w:p>
     <w:p>
@@ -1024,7 +1062,31 @@
           <w:color w:val="1F2A26"/>
           <w:sz w:val="22"/>
         </w:rPr>
-        <w:t>客户或介绍人身份不能打开你的量房编辑器</w:t>
+        <w:t>客户或推广人身份不能打开你的量房编辑器</w:t>
+      </w:r>
+    </w:p>
+    <w:p>
+      <w:pPr>
+        <w:spacing w:before="20" w:after="80" w:line="288" w:lineRule="auto"/>
+        <w:ind w:left="312"/>
+      </w:pPr>
+      <w:r>
+        <w:rPr>
+          <w:rFonts w:ascii="Calibri" w:hAnsi="Calibri" w:eastAsia="Microsoft YaHei"/>
+          <w:b/>
+          <w:color w:val="1F8A5B"/>
+          <w:sz w:val="22"/>
+        </w:rPr>
+        <w:t xml:space="preserve">☐  </w:t>
+      </w:r>
+      <w:r>
+        <w:rPr>
+          <w:rFonts w:ascii="Calibri" w:hAnsi="Calibri" w:eastAsia="Microsoft YaHei"/>
+          <w:b w:val="0"/>
+          <w:color w:val="1F2A26"/>
+          <w:sz w:val="22"/>
+        </w:rPr>
+        <w:t>未闭合就完成预约、未连仪手动量等 → 按《操作-测距仪与量房》第 6 节勾选</w:t>
       </w:r>
     </w:p>
     <w:p>

</xml_diff>